<commit_message>
Adicionado material da aula 7, bem como anotações da aula. Incluem exemplos de como utilizar os quaternions para fazer rotações no R³, bem como algumas propriedades dos numeros hamiltonianos. Adicionalmente foi adicionado o material da aula 8 e criado o arquivo de anotações.
</commit_message>
<xml_diff>
--- a/Aula 6 - Propriedades das Matrizes de Rotação/Aula 6.docx
+++ b/Aula 6 - Propriedades das Matrizes de Rotação/Aula 6.docx
@@ -4,7 +4,7 @@
   <w:body>
     <w:p>
       <w:pPr>
-        <w:pStyle w:val="Heading2"/>
+        <w:pStyle w:val="Ttulo2"/>
         <w:rPr>
           <w:lang w:val="pt-BR"/>
         </w:rPr>
@@ -18,30 +18,16 @@
     </w:p>
     <w:p>
       <w:pPr>
-        <w:pStyle w:val="Heading3"/>
-        <w:rPr>
-          <w:lang w:val="pt-BR"/>
-        </w:rPr>
-      </w:pPr>
-      <w:r>
-        <w:rPr>
-          <w:lang w:val="pt-BR"/>
-        </w:rPr>
-        <w:t xml:space="preserve">Modulo dos vetores </w:t>
-      </w:r>
-      <w:proofErr w:type="spellStart"/>
-      <w:r>
-        <w:rPr>
-          <w:lang w:val="pt-BR"/>
-        </w:rPr>
-        <w:t>u,v</w:t>
-      </w:r>
-      <w:proofErr w:type="spellEnd"/>
-      <w:r>
-        <w:rPr>
-          <w:lang w:val="pt-BR"/>
-        </w:rPr>
-        <w:t xml:space="preserve"> e</w:t>
+        <w:pStyle w:val="Ttulo3"/>
+        <w:rPr>
+          <w:lang w:val="pt-BR"/>
+        </w:rPr>
+      </w:pPr>
+      <w:r>
+        <w:rPr>
+          <w:lang w:val="pt-BR"/>
+        </w:rPr>
+        <w:t>Modulo dos vetores u,v e</w:t>
       </w:r>
       <w:r>
         <w:rPr>
@@ -358,7 +344,7 @@
     </w:p>
     <w:p>
       <w:pPr>
-        <w:pStyle w:val="Heading3"/>
+        <w:pStyle w:val="Ttulo3"/>
         <w:rPr>
           <w:lang w:val="pt-BR"/>
         </w:rPr>
@@ -794,7 +780,7 @@
     </w:p>
     <w:p>
       <w:pPr>
-        <w:pStyle w:val="Heading3"/>
+        <w:pStyle w:val="Ttulo3"/>
         <w:rPr>
           <w:lang w:val="pt-BR"/>
         </w:rPr>
@@ -934,7 +920,7 @@
           <w:noProof/>
         </w:rPr>
         <w:drawing>
-          <wp:inline distT="0" distB="0" distL="0" distR="0" wp14:anchorId="5B92B5D8" wp14:editId="46694FC5">
+          <wp:inline distT="0" distB="0" distL="0" distR="0" wp14:anchorId="5B92B5D8" wp14:editId="6F24CE36">
             <wp:extent cx="2824817" cy="1264258"/>
             <wp:effectExtent l="0" t="0" r="0" b="0"/>
             <wp:docPr id="1430627793" name="Picture 1" descr="Uma grande diferença entre produto escalar e produto vetorial é que o  produto vetorial produz um vetor - brainly.com.br"/>
@@ -951,7 +937,7 @@
                     </pic:cNvPicPr>
                   </pic:nvPicPr>
                   <pic:blipFill>
-                    <a:blip r:embed="rId4" cstate="print">
+                    <a:blip r:embed="rId6" cstate="print">
                       <a:extLst>
                         <a:ext uri="{28A0092B-C50C-407E-A947-70E740481C1C}">
                           <a14:useLocalDpi xmlns:a14="http://schemas.microsoft.com/office/drawing/2010/main" val="0"/>
@@ -985,7 +971,7 @@
     </w:p>
     <w:p>
       <w:pPr>
-        <w:pStyle w:val="Heading2"/>
+        <w:pStyle w:val="Ttulo2"/>
         <w:rPr>
           <w:rFonts w:eastAsiaTheme="minorEastAsia"/>
           <w:lang w:val="pt-BR"/>
@@ -1129,7 +1115,7 @@
     </w:p>
     <w:p>
       <w:pPr>
-        <w:pStyle w:val="Heading3"/>
+        <w:pStyle w:val="Ttulo3"/>
         <w:rPr>
           <w:lang w:val="pt-BR"/>
         </w:rPr>
@@ -1382,11 +1368,158 @@
     </w:p>
     <w:p>
       <w:pPr>
-        <w:rPr>
-          <w:rFonts w:eastAsiaTheme="majorEastAsia" w:cstheme="majorBidi"/>
-          <w:lang w:val="pt-BR"/>
-        </w:rPr>
-      </w:pPr>
+        <w:pStyle w:val="Ttulo3"/>
+        <w:rPr>
+          <w:lang w:val="pt-BR"/>
+        </w:rPr>
+      </w:pPr>
+      <w:r>
+        <w:rPr>
+          <w:lang w:val="pt-BR"/>
+        </w:rPr>
+        <w:t xml:space="preserve">Matriz de rotação por ângulos de Euler - </w:t>
+      </w:r>
+      <w:r>
+        <w:rPr>
+          <w:lang w:val="pt-BR"/>
+        </w:rPr>
+        <w:t>Roll Pitch Yall</w:t>
+      </w:r>
+    </w:p>
+    <w:p>
+      <w:pPr>
+        <w:rPr>
+          <w:lang w:val="pt-BR"/>
+        </w:rPr>
+      </w:pPr>
+      <w:r>
+        <w:rPr>
+          <w:lang w:val="pt-BR"/>
+        </w:rPr>
+        <w:t>Basicamente é a multiplicação de 3 matrizes de rotação de cossenos diretores, sendo primeiro uma rotação em x, em seguida uma rotação em y e posteriormente uma rotação em z.</w:t>
+      </w:r>
+    </w:p>
+    <w:p>
+      <w:pPr>
+        <w:rPr>
+          <w:lang w:val="pt-BR"/>
+        </w:rPr>
+      </w:pPr>
+      <w:r>
+        <w:rPr>
+          <w:lang w:val="pt-BR"/>
+        </w:rPr>
+        <w:t>Define os ângulos de rotação em cada eixo sobre o referencial. É composto pela multiplicação das matrizes de rotação de cada eixo.</w:t>
+      </w:r>
+    </w:p>
+    <w:p>
+      <w:pPr>
+        <w:rPr>
+          <w:lang w:val="pt-BR"/>
+        </w:rPr>
+      </w:pPr>
+      <w:r>
+        <w:rPr>
+          <w:lang w:val="pt-BR"/>
+        </w:rPr>
+        <w:drawing>
+          <wp:inline distT="0" distB="0" distL="0" distR="0" wp14:anchorId="70D08AC3" wp14:editId="123D37D2">
+            <wp:extent cx="5400040" cy="3198495"/>
+            <wp:effectExtent l="0" t="0" r="0" b="1905"/>
+            <wp:docPr id="1504259360" name="Imagem 1"/>
+            <wp:cNvGraphicFramePr>
+              <a:graphicFrameLocks xmlns:a="http://schemas.openxmlformats.org/drawingml/2006/main" noChangeAspect="1"/>
+            </wp:cNvGraphicFramePr>
+            <a:graphic xmlns:a="http://schemas.openxmlformats.org/drawingml/2006/main">
+              <a:graphicData uri="http://schemas.openxmlformats.org/drawingml/2006/picture">
+                <pic:pic xmlns:pic="http://schemas.openxmlformats.org/drawingml/2006/picture">
+                  <pic:nvPicPr>
+                    <pic:cNvPr id="1504259360" name=""/>
+                    <pic:cNvPicPr/>
+                  </pic:nvPicPr>
+                  <pic:blipFill>
+                    <a:blip r:embed="rId7"/>
+                    <a:stretch>
+                      <a:fillRect/>
+                    </a:stretch>
+                  </pic:blipFill>
+                  <pic:spPr>
+                    <a:xfrm>
+                      <a:off x="0" y="0"/>
+                      <a:ext cx="5400040" cy="3198495"/>
+                    </a:xfrm>
+                    <a:prstGeom prst="rect">
+                      <a:avLst/>
+                    </a:prstGeom>
+                  </pic:spPr>
+                </pic:pic>
+              </a:graphicData>
+            </a:graphic>
+          </wp:inline>
+        </w:drawing>
+      </w:r>
+    </w:p>
+    <w:p>
+      <w:pPr>
+        <w:rPr>
+          <w:lang w:val="pt-BR"/>
+        </w:rPr>
+      </w:pPr>
+      <w:r>
+        <w:rPr>
+          <w:lang w:val="pt-BR"/>
+        </w:rPr>
+        <w:t>Permite-se descobrir quais ângulos foram rotacionados em cada eixo utilizando as seguintes equações:</w:t>
+      </w:r>
+    </w:p>
+    <w:p>
+      <w:pPr>
+        <w:jc w:val="center"/>
+        <w:rPr>
+          <w:lang w:val="pt-BR"/>
+        </w:rPr>
+      </w:pPr>
+      <w:r>
+        <w:rPr>
+          <w:lang w:val="pt-BR"/>
+        </w:rPr>
+        <w:lastRenderedPageBreak/>
+        <w:drawing>
+          <wp:inline distT="0" distB="0" distL="0" distR="0" wp14:anchorId="060FC819" wp14:editId="5B568243">
+            <wp:extent cx="2905125" cy="1272179"/>
+            <wp:effectExtent l="0" t="0" r="0" b="4445"/>
+            <wp:docPr id="1813874192" name="Imagem 1"/>
+            <wp:cNvGraphicFramePr>
+              <a:graphicFrameLocks xmlns:a="http://schemas.openxmlformats.org/drawingml/2006/main" noChangeAspect="1"/>
+            </wp:cNvGraphicFramePr>
+            <a:graphic xmlns:a="http://schemas.openxmlformats.org/drawingml/2006/main">
+              <a:graphicData uri="http://schemas.openxmlformats.org/drawingml/2006/picture">
+                <pic:pic xmlns:pic="http://schemas.openxmlformats.org/drawingml/2006/picture">
+                  <pic:nvPicPr>
+                    <pic:cNvPr id="1813874192" name=""/>
+                    <pic:cNvPicPr/>
+                  </pic:nvPicPr>
+                  <pic:blipFill>
+                    <a:blip r:embed="rId8"/>
+                    <a:stretch>
+                      <a:fillRect/>
+                    </a:stretch>
+                  </pic:blipFill>
+                  <pic:spPr>
+                    <a:xfrm>
+                      <a:off x="0" y="0"/>
+                      <a:ext cx="2909474" cy="1274083"/>
+                    </a:xfrm>
+                    <a:prstGeom prst="rect">
+                      <a:avLst/>
+                    </a:prstGeom>
+                  </pic:spPr>
+                </pic:pic>
+              </a:graphicData>
+            </a:graphic>
+          </wp:inline>
+        </w:drawing>
+      </w:r>
     </w:p>
     <w:sectPr>
       <w:pgSz w:w="11906" w:h="16838"/>
@@ -1396,6 +1529,56 @@
     </w:sectPr>
   </w:body>
 </w:document>
+</file>
+
+<file path=word/endnotes.xml><?xml version="1.0" encoding="utf-8"?>
+<w:endnotes xmlns:wpc="http://schemas.microsoft.com/office/word/2010/wordprocessingCanvas" xmlns:cx="http://schemas.microsoft.com/office/drawing/2014/chartex" xmlns:cx1="http://schemas.microsoft.com/office/drawing/2015/9/8/chartex" xmlns:cx2="http://schemas.microsoft.com/office/drawing/2015/10/21/chartex" xmlns:cx3="http://schemas.microsoft.com/office/drawing/2016/5/9/chartex" xmlns:cx4="http://schemas.microsoft.com/office/drawing/2016/5/10/chartex" xmlns:cx5="http://schemas.microsoft.com/office/drawing/2016/5/11/chartex" xmlns:cx6="http://schemas.microsoft.com/office/drawing/2016/5/12/chartex" xmlns:cx7="http://schemas.microsoft.com/office/drawing/2016/5/13/chartex" xmlns:cx8="http://schemas.microsoft.com/office/drawing/2016/5/14/chartex" xmlns:mc="http://schemas.openxmlformats.org/markup-compatibility/2006" xmlns:aink="http://schemas.microsoft.com/office/drawing/2016/ink" xmlns:am3d="http://schemas.microsoft.com/office/drawing/2017/model3d" xmlns:o="urn:schemas-microsoft-com:office:office" xmlns:oel="http://schemas.microsoft.com/office/2019/extlst" xmlns:r="http://schemas.openxmlformats.org/officeDocument/2006/relationships" xmlns:m="http://schemas.openxmlformats.org/officeDocument/2006/math" xmlns:v="urn:schemas-microsoft-com:vml" xmlns:wp14="http://schemas.microsoft.com/office/word/2010/wordprocessingDrawing" xmlns:wp="http://schemas.openxmlformats.org/drawingml/2006/wordprocessingDrawing" xmlns:w10="urn:schemas-microsoft-com:office:word" xmlns:w="http://schemas.openxmlformats.org/wordprocessingml/2006/main" xmlns:w14="http://schemas.microsoft.com/office/word/2010/wordml" xmlns:w15="http://schemas.microsoft.com/office/word/2012/wordml" xmlns:w16cex="http://schemas.microsoft.com/office/word/2018/wordml/cex" xmlns:w16cid="http://schemas.microsoft.com/office/word/2016/wordml/cid" xmlns:w16="http://schemas.microsoft.com/office/word/2018/wordml" xmlns:w16du="http://schemas.microsoft.com/office/word/2023/wordml/word16du" xmlns:w16sdtdh="http://schemas.microsoft.com/office/word/2020/wordml/sdtdatahash" xmlns:w16sdtfl="http://schemas.microsoft.com/office/word/2024/wordml/sdtformatlock" xmlns:w16se="http://schemas.microsoft.com/office/word/2015/wordml/symex" xmlns:wpg="http://schemas.microsoft.com/office/word/2010/wordprocessingGroup" xmlns:wpi="http://schemas.microsoft.com/office/word/2010/wordprocessingInk" xmlns:wne="http://schemas.microsoft.com/office/word/2006/wordml" xmlns:wps="http://schemas.microsoft.com/office/word/2010/wordprocessingShape" mc:Ignorable="w14 w15 w16se w16cid w16 w16cex w16sdtdh w16sdtfl w16du wp14">
+  <w:endnote w:type="separator" w:id="-1">
+    <w:p>
+      <w:pPr>
+        <w:spacing w:after="0" w:line="240" w:lineRule="auto"/>
+      </w:pPr>
+      <w:r>
+        <w:separator/>
+      </w:r>
+    </w:p>
+  </w:endnote>
+  <w:endnote w:type="continuationSeparator" w:id="0">
+    <w:p>
+      <w:pPr>
+        <w:spacing w:after="0" w:line="240" w:lineRule="auto"/>
+      </w:pPr>
+      <w:r>
+        <w:continuationSeparator/>
+      </w:r>
+    </w:p>
+  </w:endnote>
+</w:endnotes>
+</file>
+
+<file path=word/footnotes.xml><?xml version="1.0" encoding="utf-8"?>
+<w:footnotes xmlns:wpc="http://schemas.microsoft.com/office/word/2010/wordprocessingCanvas" xmlns:cx="http://schemas.microsoft.com/office/drawing/2014/chartex" xmlns:cx1="http://schemas.microsoft.com/office/drawing/2015/9/8/chartex" xmlns:cx2="http://schemas.microsoft.com/office/drawing/2015/10/21/chartex" xmlns:cx3="http://schemas.microsoft.com/office/drawing/2016/5/9/chartex" xmlns:cx4="http://schemas.microsoft.com/office/drawing/2016/5/10/chartex" xmlns:cx5="http://schemas.microsoft.com/office/drawing/2016/5/11/chartex" xmlns:cx6="http://schemas.microsoft.com/office/drawing/2016/5/12/chartex" xmlns:cx7="http://schemas.microsoft.com/office/drawing/2016/5/13/chartex" xmlns:cx8="http://schemas.microsoft.com/office/drawing/2016/5/14/chartex" xmlns:mc="http://schemas.openxmlformats.org/markup-compatibility/2006" xmlns:aink="http://schemas.microsoft.com/office/drawing/2016/ink" xmlns:am3d="http://schemas.microsoft.com/office/drawing/2017/model3d" xmlns:o="urn:schemas-microsoft-com:office:office" xmlns:oel="http://schemas.microsoft.com/office/2019/extlst" xmlns:r="http://schemas.openxmlformats.org/officeDocument/2006/relationships" xmlns:m="http://schemas.openxmlformats.org/officeDocument/2006/math" xmlns:v="urn:schemas-microsoft-com:vml" xmlns:wp14="http://schemas.microsoft.com/office/word/2010/wordprocessingDrawing" xmlns:wp="http://schemas.openxmlformats.org/drawingml/2006/wordprocessingDrawing" xmlns:w10="urn:schemas-microsoft-com:office:word" xmlns:w="http://schemas.openxmlformats.org/wordprocessingml/2006/main" xmlns:w14="http://schemas.microsoft.com/office/word/2010/wordml" xmlns:w15="http://schemas.microsoft.com/office/word/2012/wordml" xmlns:w16cex="http://schemas.microsoft.com/office/word/2018/wordml/cex" xmlns:w16cid="http://schemas.microsoft.com/office/word/2016/wordml/cid" xmlns:w16="http://schemas.microsoft.com/office/word/2018/wordml" xmlns:w16du="http://schemas.microsoft.com/office/word/2023/wordml/word16du" xmlns:w16sdtdh="http://schemas.microsoft.com/office/word/2020/wordml/sdtdatahash" xmlns:w16sdtfl="http://schemas.microsoft.com/office/word/2024/wordml/sdtformatlock" xmlns:w16se="http://schemas.microsoft.com/office/word/2015/wordml/symex" xmlns:wpg="http://schemas.microsoft.com/office/word/2010/wordprocessingGroup" xmlns:wpi="http://schemas.microsoft.com/office/word/2010/wordprocessingInk" xmlns:wne="http://schemas.microsoft.com/office/word/2006/wordml" xmlns:wps="http://schemas.microsoft.com/office/word/2010/wordprocessingShape" mc:Ignorable="w14 w15 w16se w16cid w16 w16cex w16sdtdh w16sdtfl w16du wp14">
+  <w:footnote w:type="separator" w:id="-1">
+    <w:p>
+      <w:pPr>
+        <w:spacing w:after="0" w:line="240" w:lineRule="auto"/>
+      </w:pPr>
+      <w:r>
+        <w:separator/>
+      </w:r>
+    </w:p>
+  </w:footnote>
+  <w:footnote w:type="continuationSeparator" w:id="0">
+    <w:p>
+      <w:pPr>
+        <w:spacing w:after="0" w:line="240" w:lineRule="auto"/>
+      </w:pPr>
+      <w:r>
+        <w:continuationSeparator/>
+      </w:r>
+    </w:p>
+  </w:footnote>
+</w:footnotes>
 </file>
 
 <file path=word/styles.xml><?xml version="1.0" encoding="utf-8"?>
@@ -1799,11 +1982,11 @@
     <w:name w:val="Normal"/>
     <w:qFormat/>
   </w:style>
-  <w:style w:type="paragraph" w:styleId="Heading1">
+  <w:style w:type="paragraph" w:styleId="Ttulo1">
     <w:name w:val="heading 1"/>
     <w:basedOn w:val="Normal"/>
     <w:next w:val="Normal"/>
-    <w:link w:val="Heading1Char"/>
+    <w:link w:val="Ttulo1Char"/>
     <w:uiPriority w:val="9"/>
     <w:qFormat/>
     <w:rsid w:val="0011172F"/>
@@ -1820,11 +2003,11 @@
       <w:szCs w:val="40"/>
     </w:rPr>
   </w:style>
-  <w:style w:type="paragraph" w:styleId="Heading2">
+  <w:style w:type="paragraph" w:styleId="Ttulo2">
     <w:name w:val="heading 2"/>
     <w:basedOn w:val="Normal"/>
     <w:next w:val="Normal"/>
-    <w:link w:val="Heading2Char"/>
+    <w:link w:val="Ttulo2Char"/>
     <w:uiPriority w:val="9"/>
     <w:unhideWhenUsed/>
     <w:qFormat/>
@@ -1842,11 +2025,11 @@
       <w:szCs w:val="32"/>
     </w:rPr>
   </w:style>
-  <w:style w:type="paragraph" w:styleId="Heading3">
+  <w:style w:type="paragraph" w:styleId="Ttulo3">
     <w:name w:val="heading 3"/>
     <w:basedOn w:val="Normal"/>
     <w:next w:val="Normal"/>
-    <w:link w:val="Heading3Char"/>
+    <w:link w:val="Ttulo3Char"/>
     <w:uiPriority w:val="9"/>
     <w:unhideWhenUsed/>
     <w:qFormat/>
@@ -1864,11 +2047,11 @@
       <w:szCs w:val="28"/>
     </w:rPr>
   </w:style>
-  <w:style w:type="paragraph" w:styleId="Heading4">
+  <w:style w:type="paragraph" w:styleId="Ttulo4">
     <w:name w:val="heading 4"/>
     <w:basedOn w:val="Normal"/>
     <w:next w:val="Normal"/>
-    <w:link w:val="Heading4Char"/>
+    <w:link w:val="Ttulo4Char"/>
     <w:uiPriority w:val="9"/>
     <w:semiHidden/>
     <w:unhideWhenUsed/>
@@ -1887,11 +2070,11 @@
       <w:color w:val="0F4761" w:themeColor="accent1" w:themeShade="BF"/>
     </w:rPr>
   </w:style>
-  <w:style w:type="paragraph" w:styleId="Heading5">
+  <w:style w:type="paragraph" w:styleId="Ttulo5">
     <w:name w:val="heading 5"/>
     <w:basedOn w:val="Normal"/>
     <w:next w:val="Normal"/>
-    <w:link w:val="Heading5Char"/>
+    <w:link w:val="Ttulo5Char"/>
     <w:uiPriority w:val="9"/>
     <w:semiHidden/>
     <w:unhideWhenUsed/>
@@ -1908,11 +2091,11 @@
       <w:color w:val="0F4761" w:themeColor="accent1" w:themeShade="BF"/>
     </w:rPr>
   </w:style>
-  <w:style w:type="paragraph" w:styleId="Heading6">
+  <w:style w:type="paragraph" w:styleId="Ttulo6">
     <w:name w:val="heading 6"/>
     <w:basedOn w:val="Normal"/>
     <w:next w:val="Normal"/>
-    <w:link w:val="Heading6Char"/>
+    <w:link w:val="Ttulo6Char"/>
     <w:uiPriority w:val="9"/>
     <w:semiHidden/>
     <w:unhideWhenUsed/>
@@ -1931,11 +2114,11 @@
       <w:color w:val="595959" w:themeColor="text1" w:themeTint="A6"/>
     </w:rPr>
   </w:style>
-  <w:style w:type="paragraph" w:styleId="Heading7">
+  <w:style w:type="paragraph" w:styleId="Ttulo7">
     <w:name w:val="heading 7"/>
     <w:basedOn w:val="Normal"/>
     <w:next w:val="Normal"/>
-    <w:link w:val="Heading7Char"/>
+    <w:link w:val="Ttulo7Char"/>
     <w:uiPriority w:val="9"/>
     <w:semiHidden/>
     <w:unhideWhenUsed/>
@@ -1952,11 +2135,11 @@
       <w:color w:val="595959" w:themeColor="text1" w:themeTint="A6"/>
     </w:rPr>
   </w:style>
-  <w:style w:type="paragraph" w:styleId="Heading8">
+  <w:style w:type="paragraph" w:styleId="Ttulo8">
     <w:name w:val="heading 8"/>
     <w:basedOn w:val="Normal"/>
     <w:next w:val="Normal"/>
-    <w:link w:val="Heading8Char"/>
+    <w:link w:val="Ttulo8Char"/>
     <w:uiPriority w:val="9"/>
     <w:semiHidden/>
     <w:unhideWhenUsed/>
@@ -1975,11 +2158,11 @@
       <w:color w:val="272727" w:themeColor="text1" w:themeTint="D8"/>
     </w:rPr>
   </w:style>
-  <w:style w:type="paragraph" w:styleId="Heading9">
+  <w:style w:type="paragraph" w:styleId="Ttulo9">
     <w:name w:val="heading 9"/>
     <w:basedOn w:val="Normal"/>
     <w:next w:val="Normal"/>
-    <w:link w:val="Heading9Char"/>
+    <w:link w:val="Ttulo9Char"/>
     <w:uiPriority w:val="9"/>
     <w:semiHidden/>
     <w:unhideWhenUsed/>
@@ -1996,13 +2179,13 @@
       <w:color w:val="272727" w:themeColor="text1" w:themeTint="D8"/>
     </w:rPr>
   </w:style>
-  <w:style w:type="character" w:default="1" w:styleId="DefaultParagraphFont">
+  <w:style w:type="character" w:default="1" w:styleId="Fontepargpadro">
     <w:name w:val="Default Paragraph Font"/>
     <w:uiPriority w:val="1"/>
     <w:semiHidden/>
     <w:unhideWhenUsed/>
   </w:style>
-  <w:style w:type="table" w:default="1" w:styleId="TableNormal">
+  <w:style w:type="table" w:default="1" w:styleId="Tabelanormal">
     <w:name w:val="Normal Table"/>
     <w:uiPriority w:val="99"/>
     <w:semiHidden/>
@@ -2017,16 +2200,16 @@
       </w:tblCellMar>
     </w:tblPr>
   </w:style>
-  <w:style w:type="numbering" w:default="1" w:styleId="NoList">
+  <w:style w:type="numbering" w:default="1" w:styleId="Semlista">
     <w:name w:val="No List"/>
     <w:uiPriority w:val="99"/>
     <w:semiHidden/>
     <w:unhideWhenUsed/>
   </w:style>
-  <w:style w:type="character" w:customStyle="1" w:styleId="Heading1Char">
-    <w:name w:val="Heading 1 Char"/>
-    <w:basedOn w:val="DefaultParagraphFont"/>
-    <w:link w:val="Heading1"/>
+  <w:style w:type="character" w:customStyle="1" w:styleId="Ttulo1Char">
+    <w:name w:val="Título 1 Char"/>
+    <w:basedOn w:val="Fontepargpadro"/>
+    <w:link w:val="Ttulo1"/>
     <w:uiPriority w:val="9"/>
     <w:rsid w:val="0011172F"/>
     <w:rPr>
@@ -2036,10 +2219,10 @@
       <w:szCs w:val="40"/>
     </w:rPr>
   </w:style>
-  <w:style w:type="character" w:customStyle="1" w:styleId="Heading2Char">
-    <w:name w:val="Heading 2 Char"/>
-    <w:basedOn w:val="DefaultParagraphFont"/>
-    <w:link w:val="Heading2"/>
+  <w:style w:type="character" w:customStyle="1" w:styleId="Ttulo2Char">
+    <w:name w:val="Título 2 Char"/>
+    <w:basedOn w:val="Fontepargpadro"/>
+    <w:link w:val="Ttulo2"/>
     <w:uiPriority w:val="9"/>
     <w:rsid w:val="0011172F"/>
     <w:rPr>
@@ -2049,10 +2232,10 @@
       <w:szCs w:val="32"/>
     </w:rPr>
   </w:style>
-  <w:style w:type="character" w:customStyle="1" w:styleId="Heading3Char">
-    <w:name w:val="Heading 3 Char"/>
-    <w:basedOn w:val="DefaultParagraphFont"/>
-    <w:link w:val="Heading3"/>
+  <w:style w:type="character" w:customStyle="1" w:styleId="Ttulo3Char">
+    <w:name w:val="Título 3 Char"/>
+    <w:basedOn w:val="Fontepargpadro"/>
+    <w:link w:val="Ttulo3"/>
     <w:uiPriority w:val="9"/>
     <w:rsid w:val="0011172F"/>
     <w:rPr>
@@ -2062,10 +2245,10 @@
       <w:szCs w:val="28"/>
     </w:rPr>
   </w:style>
-  <w:style w:type="character" w:customStyle="1" w:styleId="Heading4Char">
-    <w:name w:val="Heading 4 Char"/>
-    <w:basedOn w:val="DefaultParagraphFont"/>
-    <w:link w:val="Heading4"/>
+  <w:style w:type="character" w:customStyle="1" w:styleId="Ttulo4Char">
+    <w:name w:val="Título 4 Char"/>
+    <w:basedOn w:val="Fontepargpadro"/>
+    <w:link w:val="Ttulo4"/>
     <w:uiPriority w:val="9"/>
     <w:semiHidden/>
     <w:rsid w:val="0011172F"/>
@@ -2076,10 +2259,10 @@
       <w:color w:val="0F4761" w:themeColor="accent1" w:themeShade="BF"/>
     </w:rPr>
   </w:style>
-  <w:style w:type="character" w:customStyle="1" w:styleId="Heading5Char">
-    <w:name w:val="Heading 5 Char"/>
-    <w:basedOn w:val="DefaultParagraphFont"/>
-    <w:link w:val="Heading5"/>
+  <w:style w:type="character" w:customStyle="1" w:styleId="Ttulo5Char">
+    <w:name w:val="Título 5 Char"/>
+    <w:basedOn w:val="Fontepargpadro"/>
+    <w:link w:val="Ttulo5"/>
     <w:uiPriority w:val="9"/>
     <w:semiHidden/>
     <w:rsid w:val="0011172F"/>
@@ -2088,10 +2271,10 @@
       <w:color w:val="0F4761" w:themeColor="accent1" w:themeShade="BF"/>
     </w:rPr>
   </w:style>
-  <w:style w:type="character" w:customStyle="1" w:styleId="Heading6Char">
-    <w:name w:val="Heading 6 Char"/>
-    <w:basedOn w:val="DefaultParagraphFont"/>
-    <w:link w:val="Heading6"/>
+  <w:style w:type="character" w:customStyle="1" w:styleId="Ttulo6Char">
+    <w:name w:val="Título 6 Char"/>
+    <w:basedOn w:val="Fontepargpadro"/>
+    <w:link w:val="Ttulo6"/>
     <w:uiPriority w:val="9"/>
     <w:semiHidden/>
     <w:rsid w:val="0011172F"/>
@@ -2102,10 +2285,10 @@
       <w:color w:val="595959" w:themeColor="text1" w:themeTint="A6"/>
     </w:rPr>
   </w:style>
-  <w:style w:type="character" w:customStyle="1" w:styleId="Heading7Char">
-    <w:name w:val="Heading 7 Char"/>
-    <w:basedOn w:val="DefaultParagraphFont"/>
-    <w:link w:val="Heading7"/>
+  <w:style w:type="character" w:customStyle="1" w:styleId="Ttulo7Char">
+    <w:name w:val="Título 7 Char"/>
+    <w:basedOn w:val="Fontepargpadro"/>
+    <w:link w:val="Ttulo7"/>
     <w:uiPriority w:val="9"/>
     <w:semiHidden/>
     <w:rsid w:val="0011172F"/>
@@ -2114,10 +2297,10 @@
       <w:color w:val="595959" w:themeColor="text1" w:themeTint="A6"/>
     </w:rPr>
   </w:style>
-  <w:style w:type="character" w:customStyle="1" w:styleId="Heading8Char">
-    <w:name w:val="Heading 8 Char"/>
-    <w:basedOn w:val="DefaultParagraphFont"/>
-    <w:link w:val="Heading8"/>
+  <w:style w:type="character" w:customStyle="1" w:styleId="Ttulo8Char">
+    <w:name w:val="Título 8 Char"/>
+    <w:basedOn w:val="Fontepargpadro"/>
+    <w:link w:val="Ttulo8"/>
     <w:uiPriority w:val="9"/>
     <w:semiHidden/>
     <w:rsid w:val="0011172F"/>
@@ -2128,10 +2311,10 @@
       <w:color w:val="272727" w:themeColor="text1" w:themeTint="D8"/>
     </w:rPr>
   </w:style>
-  <w:style w:type="character" w:customStyle="1" w:styleId="Heading9Char">
-    <w:name w:val="Heading 9 Char"/>
-    <w:basedOn w:val="DefaultParagraphFont"/>
-    <w:link w:val="Heading9"/>
+  <w:style w:type="character" w:customStyle="1" w:styleId="Ttulo9Char">
+    <w:name w:val="Título 9 Char"/>
+    <w:basedOn w:val="Fontepargpadro"/>
+    <w:link w:val="Ttulo9"/>
     <w:uiPriority w:val="9"/>
     <w:semiHidden/>
     <w:rsid w:val="0011172F"/>
@@ -2140,11 +2323,11 @@
       <w:color w:val="272727" w:themeColor="text1" w:themeTint="D8"/>
     </w:rPr>
   </w:style>
-  <w:style w:type="paragraph" w:styleId="Title">
+  <w:style w:type="paragraph" w:styleId="Ttulo">
     <w:name w:val="Title"/>
     <w:basedOn w:val="Normal"/>
     <w:next w:val="Normal"/>
-    <w:link w:val="TitleChar"/>
+    <w:link w:val="TtuloChar"/>
     <w:uiPriority w:val="10"/>
     <w:qFormat/>
     <w:rsid w:val="0011172F"/>
@@ -2160,10 +2343,10 @@
       <w:szCs w:val="56"/>
     </w:rPr>
   </w:style>
-  <w:style w:type="character" w:customStyle="1" w:styleId="TitleChar">
-    <w:name w:val="Title Char"/>
-    <w:basedOn w:val="DefaultParagraphFont"/>
-    <w:link w:val="Title"/>
+  <w:style w:type="character" w:customStyle="1" w:styleId="TtuloChar">
+    <w:name w:val="Título Char"/>
+    <w:basedOn w:val="Fontepargpadro"/>
+    <w:link w:val="Ttulo"/>
     <w:uiPriority w:val="10"/>
     <w:rsid w:val="0011172F"/>
     <w:rPr>
@@ -2174,11 +2357,11 @@
       <w:szCs w:val="56"/>
     </w:rPr>
   </w:style>
-  <w:style w:type="paragraph" w:styleId="Subtitle">
+  <w:style w:type="paragraph" w:styleId="Subttulo">
     <w:name w:val="Subtitle"/>
     <w:basedOn w:val="Normal"/>
     <w:next w:val="Normal"/>
-    <w:link w:val="SubtitleChar"/>
+    <w:link w:val="SubttuloChar"/>
     <w:uiPriority w:val="11"/>
     <w:qFormat/>
     <w:rsid w:val="0011172F"/>
@@ -2195,10 +2378,10 @@
       <w:szCs w:val="28"/>
     </w:rPr>
   </w:style>
-  <w:style w:type="character" w:customStyle="1" w:styleId="SubtitleChar">
-    <w:name w:val="Subtitle Char"/>
-    <w:basedOn w:val="DefaultParagraphFont"/>
-    <w:link w:val="Subtitle"/>
+  <w:style w:type="character" w:customStyle="1" w:styleId="SubttuloChar">
+    <w:name w:val="Subtítulo Char"/>
+    <w:basedOn w:val="Fontepargpadro"/>
+    <w:link w:val="Subttulo"/>
     <w:uiPriority w:val="11"/>
     <w:rsid w:val="0011172F"/>
     <w:rPr>
@@ -2209,11 +2392,11 @@
       <w:szCs w:val="28"/>
     </w:rPr>
   </w:style>
-  <w:style w:type="paragraph" w:styleId="Quote">
+  <w:style w:type="paragraph" w:styleId="Citao">
     <w:name w:val="Quote"/>
     <w:basedOn w:val="Normal"/>
     <w:next w:val="Normal"/>
-    <w:link w:val="QuoteChar"/>
+    <w:link w:val="CitaoChar"/>
     <w:uiPriority w:val="29"/>
     <w:qFormat/>
     <w:rsid w:val="0011172F"/>
@@ -2227,10 +2410,10 @@
       <w:color w:val="404040" w:themeColor="text1" w:themeTint="BF"/>
     </w:rPr>
   </w:style>
-  <w:style w:type="character" w:customStyle="1" w:styleId="QuoteChar">
-    <w:name w:val="Quote Char"/>
-    <w:basedOn w:val="DefaultParagraphFont"/>
-    <w:link w:val="Quote"/>
+  <w:style w:type="character" w:customStyle="1" w:styleId="CitaoChar">
+    <w:name w:val="Citação Char"/>
+    <w:basedOn w:val="Fontepargpadro"/>
+    <w:link w:val="Citao"/>
     <w:uiPriority w:val="29"/>
     <w:rsid w:val="0011172F"/>
     <w:rPr>
@@ -2239,7 +2422,7 @@
       <w:color w:val="404040" w:themeColor="text1" w:themeTint="BF"/>
     </w:rPr>
   </w:style>
-  <w:style w:type="paragraph" w:styleId="ListParagraph">
+  <w:style w:type="paragraph" w:styleId="PargrafodaLista">
     <w:name w:val="List Paragraph"/>
     <w:basedOn w:val="Normal"/>
     <w:uiPriority w:val="34"/>
@@ -2250,9 +2433,9 @@
       <w:contextualSpacing/>
     </w:pPr>
   </w:style>
-  <w:style w:type="character" w:styleId="IntenseEmphasis">
+  <w:style w:type="character" w:styleId="nfaseIntensa">
     <w:name w:val="Intense Emphasis"/>
-    <w:basedOn w:val="DefaultParagraphFont"/>
+    <w:basedOn w:val="Fontepargpadro"/>
     <w:uiPriority w:val="21"/>
     <w:qFormat/>
     <w:rsid w:val="0011172F"/>
@@ -2262,11 +2445,11 @@
       <w:color w:val="0F4761" w:themeColor="accent1" w:themeShade="BF"/>
     </w:rPr>
   </w:style>
-  <w:style w:type="paragraph" w:styleId="IntenseQuote">
+  <w:style w:type="paragraph" w:styleId="CitaoIntensa">
     <w:name w:val="Intense Quote"/>
     <w:basedOn w:val="Normal"/>
     <w:next w:val="Normal"/>
-    <w:link w:val="IntenseQuoteChar"/>
+    <w:link w:val="CitaoIntensaChar"/>
     <w:uiPriority w:val="30"/>
     <w:qFormat/>
     <w:rsid w:val="0011172F"/>
@@ -2285,10 +2468,10 @@
       <w:color w:val="0F4761" w:themeColor="accent1" w:themeShade="BF"/>
     </w:rPr>
   </w:style>
-  <w:style w:type="character" w:customStyle="1" w:styleId="IntenseQuoteChar">
-    <w:name w:val="Intense Quote Char"/>
-    <w:basedOn w:val="DefaultParagraphFont"/>
-    <w:link w:val="IntenseQuote"/>
+  <w:style w:type="character" w:customStyle="1" w:styleId="CitaoIntensaChar">
+    <w:name w:val="Citação Intensa Char"/>
+    <w:basedOn w:val="Fontepargpadro"/>
+    <w:link w:val="CitaoIntensa"/>
     <w:uiPriority w:val="30"/>
     <w:rsid w:val="0011172F"/>
     <w:rPr>
@@ -2297,9 +2480,9 @@
       <w:color w:val="0F4761" w:themeColor="accent1" w:themeShade="BF"/>
     </w:rPr>
   </w:style>
-  <w:style w:type="character" w:styleId="IntenseReference">
+  <w:style w:type="character" w:styleId="RefernciaIntensa">
     <w:name w:val="Intense Reference"/>
-    <w:basedOn w:val="DefaultParagraphFont"/>
+    <w:basedOn w:val="Fontepargpadro"/>
     <w:uiPriority w:val="32"/>
     <w:qFormat/>
     <w:rsid w:val="0011172F"/>
@@ -2311,15 +2494,59 @@
       <w:spacing w:val="5"/>
     </w:rPr>
   </w:style>
-  <w:style w:type="character" w:styleId="PlaceholderText">
+  <w:style w:type="character" w:styleId="TextodoEspaoReservado">
     <w:name w:val="Placeholder Text"/>
-    <w:basedOn w:val="DefaultParagraphFont"/>
+    <w:basedOn w:val="Fontepargpadro"/>
     <w:uiPriority w:val="99"/>
     <w:semiHidden/>
     <w:rsid w:val="005B7316"/>
     <w:rPr>
       <w:color w:val="666666"/>
     </w:rPr>
+  </w:style>
+  <w:style w:type="paragraph" w:styleId="Cabealho">
+    <w:name w:val="header"/>
+    <w:basedOn w:val="Normal"/>
+    <w:link w:val="CabealhoChar"/>
+    <w:uiPriority w:val="99"/>
+    <w:unhideWhenUsed/>
+    <w:rsid w:val="00B242C4"/>
+    <w:pPr>
+      <w:tabs>
+        <w:tab w:val="center" w:pos="4252"/>
+        <w:tab w:val="right" w:pos="8504"/>
+      </w:tabs>
+      <w:spacing w:after="0" w:line="240" w:lineRule="auto"/>
+    </w:pPr>
+  </w:style>
+  <w:style w:type="character" w:customStyle="1" w:styleId="CabealhoChar">
+    <w:name w:val="Cabeçalho Char"/>
+    <w:basedOn w:val="Fontepargpadro"/>
+    <w:link w:val="Cabealho"/>
+    <w:uiPriority w:val="99"/>
+    <w:rsid w:val="00B242C4"/>
+  </w:style>
+  <w:style w:type="paragraph" w:styleId="Rodap">
+    <w:name w:val="footer"/>
+    <w:basedOn w:val="Normal"/>
+    <w:link w:val="RodapChar"/>
+    <w:uiPriority w:val="99"/>
+    <w:unhideWhenUsed/>
+    <w:rsid w:val="00B242C4"/>
+    <w:pPr>
+      <w:tabs>
+        <w:tab w:val="center" w:pos="4252"/>
+        <w:tab w:val="right" w:pos="8504"/>
+      </w:tabs>
+      <w:spacing w:after="0" w:line="240" w:lineRule="auto"/>
+    </w:pPr>
+  </w:style>
+  <w:style w:type="character" w:customStyle="1" w:styleId="RodapChar">
+    <w:name w:val="Rodapé Char"/>
+    <w:basedOn w:val="Fontepargpadro"/>
+    <w:link w:val="Rodap"/>
+    <w:uiPriority w:val="99"/>
+    <w:rsid w:val="00B242C4"/>
   </w:style>
 </w:styles>
 </file>

</xml_diff>